<commit_message>
docs: record author's manual webcam test and clarify synthetic labelling
Report section 7.4 and PROGRESS.md now record the author's reported manual
test (launch, green-marker tracking, ship following, keyboard) and list the
webcam features it did not cover. Screenshots are explicitly distinguished
from that test. DOCX and PDF rebuilt from the Markdown source.

Co-Authored-By: Claude Opus 5.5 <noreply@anthropic.com>
</commit_message>
<xml_diff>
--- a/docs/PROJECT_REPORT.docx
+++ b/docs/PROJECT_REPORT.docx
@@ -1973,7 +1973,17 @@
     <w:p/>
     <w:p>
       <w:r>
-        <w:t xml:space="preserve">On the synthetic sequence, the tracked centroid stayed within 0.01 (normalised) of the generated position on all 60 frames. These synthetic results show the code behaves as designed. They do </w:t>
+        <w:t xml:space="preserve">On 60 frames of the </w:t>
+      </w:r>
+      <w:r>
+        <w:rPr>
+          <w:rFonts w:ascii="Consolas" w:hAnsi="Consolas"/>
+          <w:sz w:val="19"/>
+        </w:rPr>
+        <w:t>SyntheticSource</w:t>
+      </w:r>
+      <w:r>
+        <w:t xml:space="preserve"> test video, the tracked centroid stayed within 0.01 (normalised) of the generated position. These synthetic results show the code behaves as designed. They do </w:t>
       </w:r>
       <w:r>
         <w:rPr>
@@ -2066,22 +2076,37 @@
         <w:pStyle w:val="Heading2"/>
       </w:pPr>
       <w:r>
-        <w:t>7.4 Still to be verified manually</w:t>
+        <w:t>7.4 Manual webcam gameplay test (performed by the project author)</w:t>
       </w:r>
     </w:p>
     <w:p>
       <w:r>
-        <w:t xml:space="preserve">Interactive play with a physical marker (tracking stability, perceived lag, gesture menu, live K calibration and the slider calibrator window) requires a person in front of the camera. It was not performed by the automated process and must be checked manually using </w:t>
+        <w:t xml:space="preserve">The project author ran </w:t>
       </w:r>
       <w:r>
         <w:rPr>
           <w:rFonts w:ascii="Consolas" w:hAnsi="Consolas"/>
           <w:sz w:val="19"/>
         </w:rPr>
-        <w:t>docs/DEMO_GUIDE.md</w:t>
+        <w:t>.venv\Scripts\python main.py</w:t>
       </w:r>
       <w:r>
-        <w:t>.</w:t>
+        <w:t xml:space="preserve"> on their Windows laptop with a physical green marker and reported: the game launched, webcam tracking worked, the spaceship followed the green marker, and keyboard controls worked. This was a qualitative check by a person, not an automated or quantitative measurement. No accuracy or latency figures were recorded.</w:t>
+      </w:r>
+    </w:p>
+    <w:p>
+      <w:r>
+        <w:t>Not covered by that report, and therefore not verified: the gesture (hover) menu, live K calibration, the TAB diagnostics on real footage, the HOLDING/SEARCHING behaviour when the marker is hidden, camera unplug handling on real hardware, and the slider calibrator window (</w:t>
+      </w:r>
+      <w:r>
+        <w:rPr>
+          <w:rFonts w:ascii="Consolas" w:hAnsi="Consolas"/>
+          <w:sz w:val="19"/>
+        </w:rPr>
+        <w:t>scripts/calibrate_hsv.py</w:t>
+      </w:r>
+      <w:r>
+        <w:t>).</w:t>
       </w:r>
     </w:p>
     <w:p>
@@ -2104,7 +2129,16 @@
         <w:t>--camera synthetic</w:t>
       </w:r>
       <w:r>
-        <w:t>), and gameplay is flown by the demo autopilot, so that the screenshots could be produced without a person at the camera.</w:t>
+        <w:t xml:space="preserve">), and gameplay is flown by the demo autopilot, so that the screenshots could be produced without a person at the camera. They are </w:t>
+      </w:r>
+      <w:r>
+        <w:rPr>
+          <w:b/>
+        </w:rPr>
+        <w:t>not</w:t>
+      </w:r>
+      <w:r>
+        <w:t xml:space="preserve"> captures of the author's manual webcam test (§7.4).</w:t>
       </w:r>
     </w:p>
     <w:p>

</xml_diff>